<commit_message>
Fix: SmartParking only sends status, UParking opens barrier itself
</commit_message>
<xml_diff>
--- a/smartparking/docs/UPARKING_Integration.docx
+++ b/smartparking/docs/UPARKING_Integration.docx
@@ -27,14 +27,31 @@
     <w:p>
       <w:r>
         <w:t>1. UParking при выезде отправляет данные — SmartParking</w:t>
-        <w:br/>
+      </w:r>
+    </w:p>
+    <w:p>
+      <w:r>
         <w:t>2. SmartParking возвращает QR-код</w:t>
-        <w:br/>
+      </w:r>
+    </w:p>
+    <w:p>
+      <w:r>
         <w:t>3. Водитель сканирует QR — оплачивает через Click</w:t>
-        <w:br/>
-        <w:t>4. Click подтверждает оплату — SmartParking открывает шлагбаум</w:t>
-        <w:br/>
-        <w:t>5. SmartParking отправляет статус оплаты — UParking (callback)</w:t>
+      </w:r>
+    </w:p>
+    <w:p>
+      <w:r>
+        <w:t>4. Click подтверждает оплату — SmartParking</w:t>
+      </w:r>
+    </w:p>
+    <w:p>
+      <w:r>
+        <w:t>5. SmartParking отправляет статус оплачено — UParking (callback)</w:t>
+      </w:r>
+    </w:p>
+    <w:p>
+      <w:r>
+        <w:t>6. UParking сам открывает шлагбаум</w:t>
       </w:r>
     </w:p>
     <w:p>
@@ -172,7 +189,7 @@
           </w:tcPr>
           <w:p>
             <w:r>
-              <w:t>ID платёжной сессии UParking</w:t>
+              <w:t>ID сессии UParking</w:t>
             </w:r>
           </w:p>
         </w:tc>
@@ -298,7 +315,7 @@
           </w:tcPr>
           <w:p>
             <w:r>
-              <w:t>Длительность парковки (сек)</w:t>
+              <w:t>Длительность (сек)</w:t>
             </w:r>
           </w:p>
         </w:tc>
@@ -340,7 +357,7 @@
           </w:tcPr>
           <w:p>
             <w:r>
-              <w:t>Госномер автомобиля</w:t>
+              <w:t>Госномер</w:t>
             </w:r>
           </w:p>
         </w:tc>
@@ -382,7 +399,7 @@
           </w:tcPr>
           <w:p>
             <w:r>
-              <w:t>Сумма к оплате (UZS)</w:t>
+              <w:t>Сумма (UZS)</w:t>
             </w:r>
           </w:p>
         </w:tc>
@@ -480,7 +497,7 @@
       <w:r>
         <w:t>{</w:t>
         <w:br/>
-        <w:t xml:space="preserve">  "sessionId": "8f2c1a4e-9b7d-4c3a-8e21-0f5a6b7c8d90",</w:t>
+        <w:t xml:space="preserve">  "sessionId": "8f2c1a4e-...",</w:t>
         <w:br/>
         <w:t xml:space="preserve">  "parkingStart": "2026-08-06T09:14:32.000+00:00",</w:t>
         <w:br/>
@@ -643,6 +660,11 @@
     </w:p>
     <w:p>
       <w:r>
+        <w:t>После оплаты SmartParking отправляет статус на callback URL. Шлагбаум открывает сам UParking.</w:t>
+      </w:r>
+    </w:p>
+    <w:p>
+      <w:r>
         <w:rPr>
           <w:b/>
         </w:rPr>
@@ -778,7 +800,7 @@
           </w:tcPr>
           <w:p>
             <w:r>
-              <w:t>Время оплаты RFC 3339</w:t>
+              <w:t>Время оплаты</w:t>
             </w:r>
           </w:p>
         </w:tc>
@@ -796,7 +818,7 @@
       <w:r>
         <w:t>{</w:t>
         <w:br/>
-        <w:t xml:space="preserve">  "sessionId": "8f2c1a4e-9b7d-4c3a-8e21-0f5a6b7c8d90",</w:t>
+        <w:t xml:space="preserve">  "sessionId": "8f2c1a4e-...",</w:t>
         <w:br/>
         <w:t xml:space="preserve">  "billingReferenceId": "89",</w:t>
         <w:br/>

</xml_diff>

<commit_message>
Remove barrier mentions from UParking docs
</commit_message>
<xml_diff>
--- a/smartparking/docs/UPARKING_Integration.docx
+++ b/smartparking/docs/UPARKING_Integration.docx
@@ -47,11 +47,6 @@
     <w:p>
       <w:r>
         <w:t>5. SmartParking отправляет статус оплачено — UParking (callback)</w:t>
-      </w:r>
-    </w:p>
-    <w:p>
-      <w:r>
-        <w:t>6. UParking сам открывает шлагбаум</w:t>
       </w:r>
     </w:p>
     <w:p>
@@ -660,7 +655,7 @@
     </w:p>
     <w:p>
       <w:r>
-        <w:t>После оплаты SmartParking отправляет статус на callback URL. Шлагбаум открывает сам UParking.</w:t>
+        <w:t>После оплаты SmartParking отправляет статус на callback URL UParking.</w:t>
       </w:r>
     </w:p>
     <w:p>

</xml_diff>

<commit_message>
Improve UParking docs: cleaner diagram without barrier
</commit_message>
<xml_diff>
--- a/smartparking/docs/UPARKING_Integration.docx
+++ b/smartparking/docs/UPARKING_Integration.docx
@@ -26,27 +26,48 @@
     </w:p>
     <w:p>
       <w:r>
-        <w:t>1. UParking при выезде отправляет данные — SmartParking</w:t>
-      </w:r>
-    </w:p>
-    <w:p>
-      <w:r>
-        <w:t>2. SmartParking возвращает QR-код</w:t>
-      </w:r>
-    </w:p>
-    <w:p>
-      <w:r>
-        <w:t>3. Водитель сканирует QR — оплачивает через Click</w:t>
-      </w:r>
-    </w:p>
-    <w:p>
-      <w:r>
-        <w:t>4. Click подтверждает оплату — SmartParking</w:t>
-      </w:r>
-    </w:p>
-    <w:p>
-      <w:r>
-        <w:t>5. SmartParking отправляет статус оплачено — UParking (callback)</w:t>
+        <w:rPr>
+          <w:rFonts w:ascii="Consolas" w:hAnsi="Consolas"/>
+          <w:sz w:val="18"/>
+        </w:rPr>
+        <w:t xml:space="preserve">  UParking                  SmartParking                Водитель</w:t>
+        <w:br/>
+        <w:t xml:space="preserve">  ────────                  ────────────                ────────</w:t>
+        <w:br/>
+        <w:br/>
+        <w:t xml:space="preserve">  1. Данные выезда</w:t>
+        <w:br/>
+        <w:t xml:space="preserve">  ──────────────────────►  POST /api/billing/create</w:t>
+        <w:br/>
+        <w:t xml:space="preserve">                           </w:t>
+        <w:br/>
+        <w:t xml:space="preserve">                           2. Возвращает QR</w:t>
+        <w:br/>
+        <w:t xml:space="preserve">  ◄──────────────────────  { qrPayload, qrCodeBase64 }</w:t>
+        <w:br/>
+        <w:t xml:space="preserve">                           </w:t>
+        <w:br/>
+        <w:t xml:space="preserve">                           3. Отдаёт QR ──────────────►</w:t>
+        <w:br/>
+        <w:t xml:space="preserve">                                                        4. Сканирует</w:t>
+        <w:br/>
+        <w:t xml:space="preserve">                                                        и платит</w:t>
+        <w:br/>
+        <w:t xml:space="preserve">                                                        через Click</w:t>
+        <w:br/>
+        <w:t xml:space="preserve">                                                             │</w:t>
+        <w:br/>
+        <w:t xml:space="preserve">                           6. Click подтверждает ◄──────────┘</w:t>
+        <w:br/>
+        <w:t xml:space="preserve">                              оплату</w:t>
+        <w:br/>
+        <w:t xml:space="preserve">                           </w:t>
+        <w:br/>
+        <w:t xml:space="preserve">                           7. Callback: статус оплачен</w:t>
+        <w:br/>
+        <w:t xml:space="preserve">  ◄──────────────────────  POST {callbackUrl}</w:t>
+        <w:br/>
+        <w:t xml:space="preserve">                           { paid: true }</w:t>
       </w:r>
     </w:p>
     <w:p>

</xml_diff>

<commit_message>
Fix: QR goes back to UParking, not directly to driver
</commit_message>
<xml_diff>
--- a/smartparking/docs/UPARKING_Integration.docx
+++ b/smartparking/docs/UPARKING_Integration.docx
@@ -47,17 +47,17 @@
         <w:br/>
         <w:t xml:space="preserve">                           </w:t>
         <w:br/>
-        <w:t xml:space="preserve">                           3. Отдаёт QR ──────────────►</w:t>
+        <w:t xml:space="preserve">  3. Показывает QR ────────────────────────────────►</w:t>
         <w:br/>
-        <w:t xml:space="preserve">                                                        4. Сканирует</w:t>
+        <w:t xml:space="preserve">                                                       4. Сканирует</w:t>
         <w:br/>
-        <w:t xml:space="preserve">                                                        и платит</w:t>
+        <w:t xml:space="preserve">                                                       и платит</w:t>
         <w:br/>
-        <w:t xml:space="preserve">                                                        через Click</w:t>
+        <w:t xml:space="preserve">                                                       через Click</w:t>
         <w:br/>
-        <w:t xml:space="preserve">                                                             │</w:t>
+        <w:t xml:space="preserve">                                                            │</w:t>
         <w:br/>
-        <w:t xml:space="preserve">                           6. Click подтверждает ◄──────────┘</w:t>
+        <w:t xml:space="preserve">                           6. Click подтверждает ◄─────────┘</w:t>
         <w:br/>
         <w:t xml:space="preserve">                              оплату</w:t>
         <w:br/>

</xml_diff>